<commit_message>
Remove the WPS AI-generated content label and restore the one-page cover letter
- Remove the "AILabel" text box that a WPS AI save had inserted at the start of Manuscript.docx and Cover_Letter.docx
- Remove the two leading empty paragraphs added by the same save
- Refresh the file manifest checksums for both documents
</commit_message>
<xml_diff>
--- a/Cover_Letter.docx
+++ b/Cover_Letter.docx
@@ -2,68 +2,6 @@
 <file path=word/document.xml><?xml version="1.0" encoding="utf-8"?>
 <w:document xmlns:wpc="http://schemas.microsoft.com/office/word/2010/wordprocessingCanvas" xmlns:cx="http://schemas.microsoft.com/office/drawing/2014/chartex" xmlns:cx1="http://schemas.microsoft.com/office/drawing/2015/9/8/chartex" xmlns:cx2="http://schemas.microsoft.com/office/drawing/2015/10/21/chartex" xmlns:cx3="http://schemas.microsoft.com/office/drawing/2016/5/9/chartex" xmlns:cx4="http://schemas.microsoft.com/office/drawing/2016/5/10/chartex" xmlns:cx5="http://schemas.microsoft.com/office/drawing/2016/5/11/chartex" xmlns:cx6="http://schemas.microsoft.com/office/drawing/2016/5/12/chartex" xmlns:cx7="http://schemas.microsoft.com/office/drawing/2016/5/13/chartex" xmlns:cx8="http://schemas.microsoft.com/office/drawing/2016/5/14/chartex" xmlns:mc="http://schemas.openxmlformats.org/markup-compatibility/2006" xmlns:o="urn:schemas-microsoft-com:office:office" xmlns:r="http://schemas.openxmlformats.org/officeDocument/2006/relationships" xmlns:m="http://schemas.openxmlformats.org/officeDocument/2006/math" xmlns:v="urn:schemas-microsoft-com:vml" xmlns:wp14="http://schemas.microsoft.com/office/word/2010/wordprocessingDrawing" xmlns:wp="http://schemas.openxmlformats.org/drawingml/2006/wordprocessingDrawing" xmlns:w="http://schemas.openxmlformats.org/wordprocessingml/2006/main" xmlns:w14="http://schemas.microsoft.com/office/word/2010/wordml" xmlns:w10="urn:schemas-microsoft-com:office:word" xmlns:w15="http://schemas.microsoft.com/office/word/2012/wordml" xmlns:wpg="http://schemas.microsoft.com/office/word/2010/wordprocessingGroup" xmlns:wpi="http://schemas.microsoft.com/office/word/2010/wordprocessingInk" xmlns:wne="http://schemas.microsoft.com/office/word/2006/wordml" xmlns:wps="http://schemas.microsoft.com/office/word/2010/wordprocessingShape" xmlns:wpsCustomData="http://www.wps.cn/officeDocument/2013/wpsCustomData" mc:Ignorable="w14 w15 wp14">
   <w:body>
-    <w:p>
-      <w:r>
-        <w:rPr>
-          <w:noProof/>
-        </w:rPr>
-        <w:drawing>
-          <wp:inline xmlns:wp="http://schemas.openxmlformats.org/drawingml/2006/wordprocessingDrawing" distT="0" distB="0" distL="0" distR="0">
-            <wp:extent cx="2400000" cy="380000"/>
-            <wp:docPr id="1" name="AILabel"/>
-            <a:graphic xmlns:a="http://schemas.openxmlformats.org/drawingml/2006/main">
-              <a:graphicData uri="http://schemas.microsoft.com/office/word/2010/wordprocessingShape">
-                <wps:wsp xmlns:wps="http://schemas.microsoft.com/office/word/2010/wordprocessingShape">
-                  <wps:cNvSpPr txBox="1"/>
-                  <wps:spPr>
-                    <a:xfrm>
-                      <a:off x="0" y="0"/>
-                      <a:ext cx="2400000" cy="380000"/>
-                    </a:xfrm>
-                    <a:prstGeom prst="rect">
-                      <a:avLst/>
-                    </a:prstGeom>
-                    <a:solidFill>
-                      <a:srgbClr val="000000">
-                        <a:alpha val="50000"/>
-                      </a:srgbClr>
-                    </a:solidFill>
-                    <a:ln w="12700">
-                      <a:solidFill>
-                        <a:srgbClr val="FFFFFF"/>
-                      </a:solidFill>
-                    </a:ln>
-                  </wps:spPr>
-                  <wps:txbx>
-                    <w:txbxContent xmlns:w="http://schemas.openxmlformats.org/wordprocessingml/2006/main">
-                      <w:p>
-                        <w:pPr>
-                          <w:jc w:val="center"/>
-                        </w:pPr>
-                        <w:r>
-                          <w:rPr>
-                            <w:b/>
-                            <w:sz w:val="28"/>
-                            <w:szCs w:val="28"/>
-                            <w:rFonts w:eastAsia="SimSun" w:ascii="Arial" w:hAnsi="Arial"/>
-                            <w:color w:val="FFFFFF"/>
-                          </w:rPr>
-                          <w:t>含 AI 生成</w:t>
-                        </w:r>
-                      </w:p>
-                    </w:txbxContent>
-                  </wps:txbx>
-                  <wps:bodyPr anchor="ctr" anchorCtr="0" lIns="91440" tIns="45720" rIns="91440" bIns="45720">
-                    <a:noAutofit/>
-                  </wps:bodyPr>
-                </wps:wsp>
-              </a:graphicData>
-            </a:graphic>
-          </wp:inline>
-        </w:drawing>
-      </w:r>
-    </w:p>
-    <w:p/>
     <w:p>
       <w:pPr>
         <w:spacing w:after="120"/>

</xml_diff>